<commit_message>
Actualização do TCC, formatado a sua justificação e definido que o a fundamentação teórica é o capítulo 1
</commit_message>
<xml_diff>
--- a/TCC/BEENOUS-TCC.docx
+++ b/TCC/BEENOUS-TCC.docx
@@ -5,7 +5,7 @@
     <w:p>
       <w:pPr>
         <w:spacing w:line="360" w:lineRule="auto"/>
-        <w:jc w:val="both"/>
+        <w:jc w:val="center"/>
         <w:rPr>
           <w:rFonts w:ascii="Times New Roman" w:hAnsi="Times New Roman" w:cs="Times New Roman"/>
           <w:sz w:val="24"/>
@@ -64,41 +64,41 @@
     <w:p>
       <w:pPr>
         <w:spacing w:line="360" w:lineRule="auto"/>
-        <w:jc w:val="both"/>
-        <w:rPr>
-          <w:rFonts w:ascii="Times New Roman" w:hAnsi="Times New Roman" w:cs="Times New Roman"/>
-          <w:sz w:val="24"/>
-        </w:rPr>
-      </w:pPr>
-      <w:r>
-        <w:rPr>
-          <w:rFonts w:ascii="Times New Roman" w:hAnsi="Times New Roman" w:cs="Times New Roman"/>
-          <w:sz w:val="24"/>
-        </w:rPr>
-        <w:t xml:space="preserve">INSTITUTO POLITÉCNICO PRIVADO – GIAVISSAMA &amp; FILHOS LDA </w:t>
-      </w:r>
-    </w:p>
-    <w:p>
-      <w:pPr>
-        <w:spacing w:line="360" w:lineRule="auto"/>
-        <w:jc w:val="both"/>
-        <w:rPr>
-          <w:rFonts w:ascii="Times New Roman" w:hAnsi="Times New Roman" w:cs="Times New Roman"/>
-          <w:sz w:val="24"/>
-        </w:rPr>
-      </w:pPr>
-      <w:r>
-        <w:rPr>
-          <w:rFonts w:ascii="Times New Roman" w:hAnsi="Times New Roman" w:cs="Times New Roman"/>
-          <w:sz w:val="24"/>
-        </w:rPr>
-        <w:t xml:space="preserve">ÁREA DE FORMAÇÃO DE INFORMÁTICA </w:t>
-      </w:r>
-    </w:p>
-    <w:p>
-      <w:pPr>
-        <w:spacing w:line="360" w:lineRule="auto"/>
-        <w:jc w:val="both"/>
+        <w:jc w:val="center"/>
+        <w:rPr>
+          <w:rFonts w:ascii="Times New Roman" w:hAnsi="Times New Roman" w:cs="Times New Roman"/>
+          <w:sz w:val="24"/>
+        </w:rPr>
+      </w:pPr>
+      <w:r>
+        <w:rPr>
+          <w:rFonts w:ascii="Times New Roman" w:hAnsi="Times New Roman" w:cs="Times New Roman"/>
+          <w:sz w:val="24"/>
+        </w:rPr>
+        <w:t>INSTITUTO POLITÉCNICO PRIVADO – GIAVISSAMA &amp; FILHOS LDA</w:t>
+      </w:r>
+    </w:p>
+    <w:p>
+      <w:pPr>
+        <w:spacing w:line="360" w:lineRule="auto"/>
+        <w:jc w:val="center"/>
+        <w:rPr>
+          <w:rFonts w:ascii="Times New Roman" w:hAnsi="Times New Roman" w:cs="Times New Roman"/>
+          <w:sz w:val="24"/>
+        </w:rPr>
+      </w:pPr>
+      <w:r>
+        <w:rPr>
+          <w:rFonts w:ascii="Times New Roman" w:hAnsi="Times New Roman" w:cs="Times New Roman"/>
+          <w:sz w:val="24"/>
+        </w:rPr>
+        <w:t>ÁREA DE FORMAÇÃO DE INFORMÁTICA</w:t>
+      </w:r>
+    </w:p>
+    <w:p>
+      <w:pPr>
+        <w:spacing w:line="360" w:lineRule="auto"/>
+        <w:jc w:val="center"/>
         <w:rPr>
           <w:rFonts w:ascii="Times New Roman" w:hAnsi="Times New Roman" w:cs="Times New Roman"/>
           <w:sz w:val="28"/>
@@ -116,29 +116,29 @@
     <w:p>
       <w:pPr>
         <w:spacing w:line="360" w:lineRule="auto"/>
-        <w:jc w:val="both"/>
-        <w:rPr>
-          <w:rFonts w:ascii="Times New Roman" w:hAnsi="Times New Roman" w:cs="Times New Roman"/>
-          <w:sz w:val="24"/>
-          <w:szCs w:val="24"/>
-        </w:rPr>
-      </w:pPr>
-    </w:p>
-    <w:p>
-      <w:pPr>
-        <w:spacing w:line="360" w:lineRule="auto"/>
-        <w:jc w:val="both"/>
-        <w:rPr>
-          <w:rFonts w:ascii="Times New Roman" w:hAnsi="Times New Roman" w:cs="Times New Roman"/>
-          <w:sz w:val="24"/>
-          <w:szCs w:val="24"/>
-        </w:rPr>
-      </w:pPr>
-    </w:p>
-    <w:p>
-      <w:pPr>
-        <w:spacing w:line="360" w:lineRule="auto"/>
-        <w:jc w:val="both"/>
+        <w:jc w:val="center"/>
+        <w:rPr>
+          <w:rFonts w:ascii="Times New Roman" w:hAnsi="Times New Roman" w:cs="Times New Roman"/>
+          <w:sz w:val="24"/>
+          <w:szCs w:val="24"/>
+        </w:rPr>
+      </w:pPr>
+    </w:p>
+    <w:p>
+      <w:pPr>
+        <w:spacing w:line="360" w:lineRule="auto"/>
+        <w:jc w:val="center"/>
+        <w:rPr>
+          <w:rFonts w:ascii="Times New Roman" w:hAnsi="Times New Roman" w:cs="Times New Roman"/>
+          <w:sz w:val="24"/>
+          <w:szCs w:val="24"/>
+        </w:rPr>
+      </w:pPr>
+    </w:p>
+    <w:p>
+      <w:pPr>
+        <w:spacing w:line="360" w:lineRule="auto"/>
+        <w:jc w:val="center"/>
         <w:rPr>
           <w:rFonts w:ascii="Times New Roman" w:hAnsi="Times New Roman" w:cs="Times New Roman"/>
           <w:sz w:val="28"/>
@@ -156,40 +156,40 @@
     <w:p>
       <w:pPr>
         <w:spacing w:line="360" w:lineRule="auto"/>
-        <w:jc w:val="both"/>
-        <w:rPr>
-          <w:rFonts w:ascii="Times New Roman" w:hAnsi="Times New Roman" w:cs="Times New Roman"/>
-          <w:sz w:val="24"/>
-          <w:szCs w:val="24"/>
-        </w:rPr>
-      </w:pPr>
-    </w:p>
-    <w:p>
-      <w:pPr>
-        <w:spacing w:line="360" w:lineRule="auto"/>
-        <w:jc w:val="both"/>
-        <w:rPr>
-          <w:rFonts w:ascii="Times New Roman" w:hAnsi="Times New Roman" w:cs="Times New Roman"/>
-          <w:sz w:val="24"/>
-          <w:szCs w:val="24"/>
-        </w:rPr>
-      </w:pPr>
-    </w:p>
-    <w:p>
-      <w:pPr>
-        <w:spacing w:line="360" w:lineRule="auto"/>
-        <w:jc w:val="both"/>
-        <w:rPr>
-          <w:rFonts w:ascii="Times New Roman" w:hAnsi="Times New Roman" w:cs="Times New Roman"/>
-          <w:sz w:val="24"/>
-          <w:szCs w:val="24"/>
-        </w:rPr>
-      </w:pPr>
-    </w:p>
-    <w:p>
-      <w:pPr>
-        <w:spacing w:line="360" w:lineRule="auto"/>
-        <w:jc w:val="both"/>
+        <w:jc w:val="center"/>
+        <w:rPr>
+          <w:rFonts w:ascii="Times New Roman" w:hAnsi="Times New Roman" w:cs="Times New Roman"/>
+          <w:sz w:val="24"/>
+          <w:szCs w:val="24"/>
+        </w:rPr>
+      </w:pPr>
+    </w:p>
+    <w:p>
+      <w:pPr>
+        <w:spacing w:line="360" w:lineRule="auto"/>
+        <w:jc w:val="center"/>
+        <w:rPr>
+          <w:rFonts w:ascii="Times New Roman" w:hAnsi="Times New Roman" w:cs="Times New Roman"/>
+          <w:sz w:val="24"/>
+          <w:szCs w:val="24"/>
+        </w:rPr>
+      </w:pPr>
+    </w:p>
+    <w:p>
+      <w:pPr>
+        <w:spacing w:line="360" w:lineRule="auto"/>
+        <w:jc w:val="center"/>
+        <w:rPr>
+          <w:rFonts w:ascii="Times New Roman" w:hAnsi="Times New Roman" w:cs="Times New Roman"/>
+          <w:sz w:val="24"/>
+          <w:szCs w:val="24"/>
+        </w:rPr>
+      </w:pPr>
+    </w:p>
+    <w:p>
+      <w:pPr>
+        <w:spacing w:line="360" w:lineRule="auto"/>
+        <w:jc w:val="center"/>
         <w:rPr>
           <w:rFonts w:ascii="Times New Roman" w:hAnsi="Times New Roman" w:cs="Times New Roman"/>
           <w:b/>
@@ -231,46 +231,46 @@
           <w:sz w:val="28"/>
           <w:szCs w:val="24"/>
         </w:rPr>
-        <w:t xml:space="preserve"> DE MONITORAMENTO E GESTÃO INTELIGENTE DE ENERGIA COM PRIORIZAÇÃO DE CARGAS </w:t>
-      </w:r>
-    </w:p>
-    <w:p>
-      <w:pPr>
-        <w:spacing w:line="360" w:lineRule="auto"/>
-        <w:jc w:val="both"/>
-        <w:rPr>
-          <w:rFonts w:ascii="Times New Roman" w:hAnsi="Times New Roman" w:cs="Times New Roman"/>
-          <w:sz w:val="28"/>
-          <w:szCs w:val="24"/>
-        </w:rPr>
-      </w:pPr>
-    </w:p>
-    <w:p>
-      <w:pPr>
-        <w:spacing w:line="360" w:lineRule="auto"/>
-        <w:jc w:val="both"/>
-        <w:rPr>
-          <w:rFonts w:ascii="Times New Roman" w:hAnsi="Times New Roman" w:cs="Times New Roman"/>
-          <w:sz w:val="28"/>
-          <w:szCs w:val="24"/>
-        </w:rPr>
-      </w:pPr>
-    </w:p>
-    <w:p>
-      <w:pPr>
-        <w:spacing w:line="360" w:lineRule="auto"/>
-        <w:jc w:val="both"/>
-        <w:rPr>
-          <w:rFonts w:ascii="Times New Roman" w:hAnsi="Times New Roman" w:cs="Times New Roman"/>
-          <w:sz w:val="28"/>
-          <w:szCs w:val="24"/>
-        </w:rPr>
-      </w:pPr>
-    </w:p>
-    <w:p>
-      <w:pPr>
-        <w:spacing w:line="360" w:lineRule="auto"/>
-        <w:jc w:val="both"/>
+        <w:t xml:space="preserve"> DE MONITORAMENTO E GESTÃO INTELIGENTE DE ENERGIA COM PRIORIZAÇÃO DE CARGAS</w:t>
+      </w:r>
+    </w:p>
+    <w:p>
+      <w:pPr>
+        <w:spacing w:line="360" w:lineRule="auto"/>
+        <w:jc w:val="center"/>
+        <w:rPr>
+          <w:rFonts w:ascii="Times New Roman" w:hAnsi="Times New Roman" w:cs="Times New Roman"/>
+          <w:sz w:val="28"/>
+          <w:szCs w:val="24"/>
+        </w:rPr>
+      </w:pPr>
+    </w:p>
+    <w:p>
+      <w:pPr>
+        <w:spacing w:line="360" w:lineRule="auto"/>
+        <w:jc w:val="center"/>
+        <w:rPr>
+          <w:rFonts w:ascii="Times New Roman" w:hAnsi="Times New Roman" w:cs="Times New Roman"/>
+          <w:sz w:val="28"/>
+          <w:szCs w:val="24"/>
+        </w:rPr>
+      </w:pPr>
+    </w:p>
+    <w:p>
+      <w:pPr>
+        <w:spacing w:line="360" w:lineRule="auto"/>
+        <w:jc w:val="center"/>
+        <w:rPr>
+          <w:rFonts w:ascii="Times New Roman" w:hAnsi="Times New Roman" w:cs="Times New Roman"/>
+          <w:sz w:val="28"/>
+          <w:szCs w:val="24"/>
+        </w:rPr>
+      </w:pPr>
+    </w:p>
+    <w:p>
+      <w:pPr>
+        <w:spacing w:line="360" w:lineRule="auto"/>
+        <w:jc w:val="center"/>
         <w:rPr>
           <w:rFonts w:ascii="Times New Roman" w:hAnsi="Times New Roman" w:cs="Times New Roman"/>
           <w:sz w:val="28"/>
@@ -325,55 +325,55 @@
     <w:p>
       <w:pPr>
         <w:spacing w:line="360" w:lineRule="auto"/>
-        <w:jc w:val="both"/>
-        <w:rPr>
-          <w:rFonts w:ascii="Times New Roman" w:hAnsi="Times New Roman" w:cs="Times New Roman"/>
-          <w:b/>
-          <w:sz w:val="28"/>
-          <w:szCs w:val="24"/>
-        </w:rPr>
-      </w:pPr>
-    </w:p>
-    <w:p>
-      <w:pPr>
-        <w:spacing w:line="360" w:lineRule="auto"/>
-        <w:jc w:val="both"/>
-        <w:rPr>
-          <w:rFonts w:ascii="Times New Roman" w:hAnsi="Times New Roman" w:cs="Times New Roman"/>
-          <w:b/>
-          <w:sz w:val="28"/>
-          <w:szCs w:val="24"/>
-        </w:rPr>
-      </w:pPr>
-    </w:p>
-    <w:p>
-      <w:pPr>
-        <w:spacing w:line="360" w:lineRule="auto"/>
-        <w:jc w:val="both"/>
-        <w:rPr>
-          <w:rFonts w:ascii="Times New Roman" w:hAnsi="Times New Roman" w:cs="Times New Roman"/>
-          <w:b/>
-          <w:sz w:val="28"/>
-          <w:szCs w:val="24"/>
-        </w:rPr>
-      </w:pPr>
-    </w:p>
-    <w:p>
-      <w:pPr>
-        <w:spacing w:line="360" w:lineRule="auto"/>
-        <w:jc w:val="both"/>
-        <w:rPr>
-          <w:rFonts w:ascii="Times New Roman" w:hAnsi="Times New Roman" w:cs="Times New Roman"/>
-          <w:b/>
-          <w:sz w:val="28"/>
-          <w:szCs w:val="24"/>
-        </w:rPr>
-      </w:pPr>
-    </w:p>
-    <w:p>
-      <w:pPr>
-        <w:spacing w:line="360" w:lineRule="auto"/>
-        <w:jc w:val="both"/>
+        <w:jc w:val="center"/>
+        <w:rPr>
+          <w:rFonts w:ascii="Times New Roman" w:hAnsi="Times New Roman" w:cs="Times New Roman"/>
+          <w:b/>
+          <w:sz w:val="28"/>
+          <w:szCs w:val="24"/>
+        </w:rPr>
+      </w:pPr>
+    </w:p>
+    <w:p>
+      <w:pPr>
+        <w:spacing w:line="360" w:lineRule="auto"/>
+        <w:jc w:val="center"/>
+        <w:rPr>
+          <w:rFonts w:ascii="Times New Roman" w:hAnsi="Times New Roman" w:cs="Times New Roman"/>
+          <w:b/>
+          <w:sz w:val="28"/>
+          <w:szCs w:val="24"/>
+        </w:rPr>
+      </w:pPr>
+    </w:p>
+    <w:p>
+      <w:pPr>
+        <w:spacing w:line="360" w:lineRule="auto"/>
+        <w:jc w:val="center"/>
+        <w:rPr>
+          <w:rFonts w:ascii="Times New Roman" w:hAnsi="Times New Roman" w:cs="Times New Roman"/>
+          <w:b/>
+          <w:sz w:val="28"/>
+          <w:szCs w:val="24"/>
+        </w:rPr>
+      </w:pPr>
+    </w:p>
+    <w:p>
+      <w:pPr>
+        <w:spacing w:line="360" w:lineRule="auto"/>
+        <w:jc w:val="center"/>
+        <w:rPr>
+          <w:rFonts w:ascii="Times New Roman" w:hAnsi="Times New Roman" w:cs="Times New Roman"/>
+          <w:b/>
+          <w:sz w:val="28"/>
+          <w:szCs w:val="24"/>
+        </w:rPr>
+      </w:pPr>
+    </w:p>
+    <w:p>
+      <w:pPr>
+        <w:spacing w:line="360" w:lineRule="auto"/>
+        <w:jc w:val="center"/>
         <w:rPr>
           <w:rFonts w:ascii="Times New Roman" w:hAnsi="Times New Roman" w:cs="Times New Roman"/>
           <w:b/>
@@ -393,7 +393,7 @@
     <w:p>
       <w:pPr>
         <w:spacing w:line="360" w:lineRule="auto"/>
-        <w:jc w:val="both"/>
+        <w:jc w:val="center"/>
         <w:rPr>
           <w:rFonts w:ascii="Times New Roman" w:hAnsi="Times New Roman" w:cs="Times New Roman"/>
           <w:sz w:val="28"/>
@@ -413,91 +413,91 @@
     <w:p>
       <w:pPr>
         <w:spacing w:line="360" w:lineRule="auto"/>
-        <w:jc w:val="both"/>
-        <w:rPr>
-          <w:rFonts w:ascii="Times New Roman" w:hAnsi="Times New Roman" w:cs="Times New Roman"/>
-          <w:b/>
-          <w:sz w:val="28"/>
-          <w:szCs w:val="24"/>
-        </w:rPr>
-      </w:pPr>
-    </w:p>
-    <w:p>
-      <w:pPr>
-        <w:spacing w:line="360" w:lineRule="auto"/>
-        <w:jc w:val="both"/>
-        <w:rPr>
-          <w:rFonts w:ascii="Times New Roman" w:hAnsi="Times New Roman" w:cs="Times New Roman"/>
-          <w:b/>
-          <w:sz w:val="28"/>
-          <w:szCs w:val="24"/>
-        </w:rPr>
-      </w:pPr>
-    </w:p>
-    <w:p>
-      <w:pPr>
-        <w:spacing w:line="360" w:lineRule="auto"/>
-        <w:jc w:val="both"/>
-        <w:rPr>
-          <w:rFonts w:ascii="Times New Roman" w:hAnsi="Times New Roman" w:cs="Times New Roman"/>
-          <w:b/>
-          <w:sz w:val="28"/>
-          <w:szCs w:val="24"/>
-        </w:rPr>
-      </w:pPr>
-    </w:p>
-    <w:p>
-      <w:pPr>
-        <w:spacing w:line="360" w:lineRule="auto"/>
-        <w:jc w:val="both"/>
-        <w:rPr>
-          <w:rFonts w:ascii="Times New Roman" w:hAnsi="Times New Roman" w:cs="Times New Roman"/>
-          <w:b/>
-          <w:sz w:val="28"/>
-          <w:szCs w:val="24"/>
-        </w:rPr>
-      </w:pPr>
-    </w:p>
-    <w:p>
-      <w:pPr>
-        <w:spacing w:line="360" w:lineRule="auto"/>
-        <w:jc w:val="both"/>
-        <w:rPr>
-          <w:rFonts w:ascii="Times New Roman" w:hAnsi="Times New Roman" w:cs="Times New Roman"/>
-          <w:b/>
-          <w:sz w:val="28"/>
-          <w:szCs w:val="24"/>
-        </w:rPr>
-      </w:pPr>
-    </w:p>
-    <w:p>
-      <w:pPr>
-        <w:spacing w:line="360" w:lineRule="auto"/>
-        <w:jc w:val="both"/>
-        <w:rPr>
-          <w:rFonts w:ascii="Times New Roman" w:hAnsi="Times New Roman" w:cs="Times New Roman"/>
-          <w:b/>
-          <w:sz w:val="28"/>
-          <w:szCs w:val="24"/>
-        </w:rPr>
-      </w:pPr>
-    </w:p>
-    <w:p>
-      <w:pPr>
-        <w:spacing w:line="360" w:lineRule="auto"/>
-        <w:jc w:val="both"/>
-        <w:rPr>
-          <w:rFonts w:ascii="Times New Roman" w:hAnsi="Times New Roman" w:cs="Times New Roman"/>
-          <w:b/>
-          <w:sz w:val="28"/>
-          <w:szCs w:val="24"/>
-        </w:rPr>
-      </w:pPr>
-    </w:p>
-    <w:p>
-      <w:pPr>
-        <w:spacing w:line="360" w:lineRule="auto"/>
-        <w:jc w:val="both"/>
+        <w:jc w:val="center"/>
+        <w:rPr>
+          <w:rFonts w:ascii="Times New Roman" w:hAnsi="Times New Roman" w:cs="Times New Roman"/>
+          <w:b/>
+          <w:sz w:val="28"/>
+          <w:szCs w:val="24"/>
+        </w:rPr>
+      </w:pPr>
+    </w:p>
+    <w:p>
+      <w:pPr>
+        <w:spacing w:line="360" w:lineRule="auto"/>
+        <w:jc w:val="center"/>
+        <w:rPr>
+          <w:rFonts w:ascii="Times New Roman" w:hAnsi="Times New Roman" w:cs="Times New Roman"/>
+          <w:b/>
+          <w:sz w:val="28"/>
+          <w:szCs w:val="24"/>
+        </w:rPr>
+      </w:pPr>
+    </w:p>
+    <w:p>
+      <w:pPr>
+        <w:spacing w:line="360" w:lineRule="auto"/>
+        <w:jc w:val="center"/>
+        <w:rPr>
+          <w:rFonts w:ascii="Times New Roman" w:hAnsi="Times New Roman" w:cs="Times New Roman"/>
+          <w:b/>
+          <w:sz w:val="28"/>
+          <w:szCs w:val="24"/>
+        </w:rPr>
+      </w:pPr>
+    </w:p>
+    <w:p>
+      <w:pPr>
+        <w:spacing w:line="360" w:lineRule="auto"/>
+        <w:jc w:val="center"/>
+        <w:rPr>
+          <w:rFonts w:ascii="Times New Roman" w:hAnsi="Times New Roman" w:cs="Times New Roman"/>
+          <w:b/>
+          <w:sz w:val="28"/>
+          <w:szCs w:val="24"/>
+        </w:rPr>
+      </w:pPr>
+    </w:p>
+    <w:p>
+      <w:pPr>
+        <w:spacing w:line="360" w:lineRule="auto"/>
+        <w:jc w:val="center"/>
+        <w:rPr>
+          <w:rFonts w:ascii="Times New Roman" w:hAnsi="Times New Roman" w:cs="Times New Roman"/>
+          <w:b/>
+          <w:sz w:val="28"/>
+          <w:szCs w:val="24"/>
+        </w:rPr>
+      </w:pPr>
+    </w:p>
+    <w:p>
+      <w:pPr>
+        <w:spacing w:line="360" w:lineRule="auto"/>
+        <w:jc w:val="center"/>
+        <w:rPr>
+          <w:rFonts w:ascii="Times New Roman" w:hAnsi="Times New Roman" w:cs="Times New Roman"/>
+          <w:b/>
+          <w:sz w:val="28"/>
+          <w:szCs w:val="24"/>
+        </w:rPr>
+      </w:pPr>
+    </w:p>
+    <w:p>
+      <w:pPr>
+        <w:spacing w:line="360" w:lineRule="auto"/>
+        <w:jc w:val="center"/>
+        <w:rPr>
+          <w:rFonts w:ascii="Times New Roman" w:hAnsi="Times New Roman" w:cs="Times New Roman"/>
+          <w:b/>
+          <w:sz w:val="28"/>
+          <w:szCs w:val="24"/>
+        </w:rPr>
+      </w:pPr>
+    </w:p>
+    <w:p>
+      <w:pPr>
+        <w:spacing w:line="360" w:lineRule="auto"/>
+        <w:jc w:val="center"/>
         <w:rPr>
           <w:rFonts w:ascii="Times New Roman" w:hAnsi="Times New Roman" w:cs="Times New Roman"/>
           <w:b/>
@@ -530,61 +530,61 @@
           <w:sz w:val="28"/>
           <w:szCs w:val="24"/>
         </w:rPr>
-        <w:t xml:space="preserve"> DE MONITORAMENTO E GESTÃO INTELIGENTE DE ENERGIA COM PRIORIZAÇÃO DE CARGAS </w:t>
-      </w:r>
-    </w:p>
-    <w:p>
-      <w:pPr>
-        <w:spacing w:line="360" w:lineRule="auto"/>
-        <w:jc w:val="both"/>
-        <w:rPr>
-          <w:rFonts w:ascii="Times New Roman" w:hAnsi="Times New Roman" w:cs="Times New Roman"/>
-          <w:b/>
-          <w:sz w:val="28"/>
-          <w:szCs w:val="24"/>
-        </w:rPr>
-      </w:pPr>
-    </w:p>
-    <w:p>
-      <w:pPr>
-        <w:spacing w:line="360" w:lineRule="auto"/>
-        <w:jc w:val="both"/>
-        <w:rPr>
-          <w:rFonts w:ascii="Times New Roman" w:hAnsi="Times New Roman" w:cs="Times New Roman"/>
-          <w:b/>
-          <w:sz w:val="28"/>
-          <w:szCs w:val="24"/>
-        </w:rPr>
-      </w:pPr>
-    </w:p>
-    <w:p>
-      <w:pPr>
-        <w:spacing w:line="360" w:lineRule="auto"/>
-        <w:jc w:val="both"/>
-        <w:rPr>
-          <w:rFonts w:ascii="Times New Roman" w:hAnsi="Times New Roman" w:cs="Times New Roman"/>
-          <w:b/>
-          <w:sz w:val="28"/>
-          <w:szCs w:val="24"/>
-        </w:rPr>
-      </w:pPr>
-    </w:p>
-    <w:p>
-      <w:pPr>
-        <w:spacing w:line="360" w:lineRule="auto"/>
-        <w:jc w:val="both"/>
-        <w:rPr>
-          <w:rFonts w:ascii="Times New Roman" w:hAnsi="Times New Roman" w:cs="Times New Roman"/>
-          <w:b/>
-          <w:sz w:val="28"/>
-          <w:szCs w:val="24"/>
-        </w:rPr>
-      </w:pPr>
-    </w:p>
-    <w:p>
-      <w:pPr>
-        <w:spacing w:line="360" w:lineRule="auto"/>
-        <w:jc w:val="both"/>
+        <w:t xml:space="preserve"> DE MONITORAMENTO E GESTÃO INTELIGENTE DE ENERGIA COM PRIORIZAÇÃO DE CARGAS</w:t>
+      </w:r>
+    </w:p>
+    <w:p>
+      <w:pPr>
+        <w:spacing w:line="360" w:lineRule="auto"/>
+        <w:jc w:val="center"/>
+        <w:rPr>
+          <w:rFonts w:ascii="Times New Roman" w:hAnsi="Times New Roman" w:cs="Times New Roman"/>
+          <w:b/>
+          <w:sz w:val="28"/>
+          <w:szCs w:val="24"/>
+        </w:rPr>
+      </w:pPr>
+    </w:p>
+    <w:p>
+      <w:pPr>
+        <w:spacing w:line="360" w:lineRule="auto"/>
+        <w:jc w:val="center"/>
+        <w:rPr>
+          <w:rFonts w:ascii="Times New Roman" w:hAnsi="Times New Roman" w:cs="Times New Roman"/>
+          <w:b/>
+          <w:sz w:val="28"/>
+          <w:szCs w:val="24"/>
+        </w:rPr>
+      </w:pPr>
+    </w:p>
+    <w:p>
+      <w:pPr>
+        <w:spacing w:line="360" w:lineRule="auto"/>
+        <w:jc w:val="center"/>
+        <w:rPr>
+          <w:rFonts w:ascii="Times New Roman" w:hAnsi="Times New Roman" w:cs="Times New Roman"/>
+          <w:b/>
+          <w:sz w:val="28"/>
+          <w:szCs w:val="24"/>
+        </w:rPr>
+      </w:pPr>
+    </w:p>
+    <w:p>
+      <w:pPr>
+        <w:spacing w:line="360" w:lineRule="auto"/>
+        <w:jc w:val="center"/>
+        <w:rPr>
+          <w:rFonts w:ascii="Times New Roman" w:hAnsi="Times New Roman" w:cs="Times New Roman"/>
+          <w:b/>
+          <w:sz w:val="28"/>
+          <w:szCs w:val="24"/>
+        </w:rPr>
+      </w:pPr>
+    </w:p>
+    <w:p>
+      <w:pPr>
+        <w:spacing w:line="360" w:lineRule="auto"/>
+        <w:jc w:val="center"/>
         <w:rPr>
           <w:rFonts w:ascii="Times New Roman" w:hAnsi="Times New Roman" w:cs="Times New Roman"/>
           <w:b/>
@@ -597,7 +597,7 @@
       <w:pPr>
         <w:spacing w:line="360" w:lineRule="auto"/>
         <w:ind w:left="3969"/>
-        <w:jc w:val="both"/>
+        <w:jc w:val="center"/>
         <w:rPr>
           <w:rFonts w:ascii="Times New Roman" w:hAnsi="Times New Roman" w:cs="Times New Roman"/>
           <w:sz w:val="20"/>
@@ -680,31 +680,31 @@
     <w:p>
       <w:pPr>
         <w:spacing w:line="360" w:lineRule="auto"/>
-        <w:jc w:val="both"/>
-        <w:rPr>
-          <w:rFonts w:ascii="Times New Roman" w:hAnsi="Times New Roman" w:cs="Times New Roman"/>
-          <w:b/>
-          <w:sz w:val="28"/>
-          <w:szCs w:val="24"/>
-        </w:rPr>
-      </w:pPr>
-    </w:p>
-    <w:p>
-      <w:pPr>
-        <w:spacing w:line="360" w:lineRule="auto"/>
-        <w:jc w:val="both"/>
-        <w:rPr>
-          <w:rFonts w:ascii="Times New Roman" w:hAnsi="Times New Roman" w:cs="Times New Roman"/>
-          <w:b/>
-          <w:sz w:val="28"/>
-          <w:szCs w:val="24"/>
-        </w:rPr>
-      </w:pPr>
-    </w:p>
-    <w:p>
-      <w:pPr>
-        <w:spacing w:line="360" w:lineRule="auto"/>
-        <w:jc w:val="both"/>
+        <w:jc w:val="center"/>
+        <w:rPr>
+          <w:rFonts w:ascii="Times New Roman" w:hAnsi="Times New Roman" w:cs="Times New Roman"/>
+          <w:b/>
+          <w:sz w:val="28"/>
+          <w:szCs w:val="24"/>
+        </w:rPr>
+      </w:pPr>
+    </w:p>
+    <w:p>
+      <w:pPr>
+        <w:spacing w:line="360" w:lineRule="auto"/>
+        <w:jc w:val="center"/>
+        <w:rPr>
+          <w:rFonts w:ascii="Times New Roman" w:hAnsi="Times New Roman" w:cs="Times New Roman"/>
+          <w:b/>
+          <w:sz w:val="28"/>
+          <w:szCs w:val="24"/>
+        </w:rPr>
+      </w:pPr>
+    </w:p>
+    <w:p>
+      <w:pPr>
+        <w:spacing w:line="360" w:lineRule="auto"/>
+        <w:jc w:val="center"/>
         <w:rPr>
           <w:rFonts w:ascii="Times New Roman" w:hAnsi="Times New Roman" w:cs="Times New Roman"/>
           <w:b/>
@@ -725,7 +725,7 @@
     <w:p>
       <w:pPr>
         <w:spacing w:line="360" w:lineRule="auto"/>
-        <w:jc w:val="both"/>
+        <w:jc w:val="center"/>
         <w:rPr>
           <w:rFonts w:ascii="Times New Roman" w:hAnsi="Times New Roman" w:cs="Times New Roman"/>
           <w:b/>
@@ -1789,6 +1789,15 @@
           <w:szCs w:val="24"/>
         </w:rPr>
       </w:pPr>
+      <w:r>
+        <w:rPr>
+          <w:rFonts w:ascii="Times New Roman" w:hAnsi="Times New Roman" w:cs="Times New Roman"/>
+          <w:b/>
+          <w:sz w:val="24"/>
+          <w:szCs w:val="24"/>
+        </w:rPr>
+        <w:t xml:space="preserve"> </w:t>
+      </w:r>
     </w:p>
     <w:p>
       <w:pPr>
@@ -1844,6 +1853,8 @@
         </w:rPr>
         <w:tab/>
       </w:r>
+      <w:bookmarkStart w:id="0" w:name="_GoBack"/>
+      <w:bookmarkEnd w:id="0"/>
     </w:p>
     <w:p>
       <w:pPr>
@@ -8736,8 +8747,6 @@
       <w:r>
         <w:t>Escalonamento de cargas: alteração do momento ou da ordem de funcionamento de cargas, de acordo com as condições e os critérios definidos.</w:t>
       </w:r>
-      <w:bookmarkStart w:id="0" w:name="_GoBack"/>
-      <w:bookmarkEnd w:id="0"/>
     </w:p>
     <w:p>
       <w:pPr>
@@ -11767,7 +11776,7 @@
 </file>
 
 <file path=customXml/itemProps1.xml><?xml version="1.0" encoding="utf-8"?>
-<ds:datastoreItem xmlns:ds="http://schemas.openxmlformats.org/officeDocument/2006/customXml" ds:itemID="{F3074A97-EAC5-41C4-8CB9-6C7B2F2A52EE}">
+<ds:datastoreItem xmlns:ds="http://schemas.openxmlformats.org/officeDocument/2006/customXml" ds:itemID="{761497A6-6A8D-4F99-8BE8-C5314037162D}">
   <ds:schemaRefs>
     <ds:schemaRef ds:uri="http://schemas.openxmlformats.org/officeDocument/2006/bibliography"/>
   </ds:schemaRefs>

</xml_diff>